<commit_message>
Paper v0.2: all 91 markets (81 geopolitical in 50 clusters, 10 controls), VIXY added, closure_tables.py, xcorr guard
</commit_message>
<xml_diff>
--- a/paper/paper.docx
+++ b/paper/paper.docx
@@ -149,7 +149,7 @@
         <w:t xml:space="preserve"> </w:t>
       </w:r>
       <w:r>
-        <w:t xml:space="preserve">v0.1)</w:t>
+        <w:t xml:space="preserve">v0.2)</w:t>
       </w:r>
     </w:p>
     <w:bookmarkStart w:id="20" w:name="abstract"/>
@@ -166,7 +166,7 @@
         <w:pStyle w:val="FirstParagraph"/>
       </w:pPr>
       <w:r>
-        <w:t xml:space="preserve">Do prediction markets lead conventional financial markets on geopolitical events? Using minute-level prices for 67 Polymarket contracts on the US-Iran conflict, the Strait of Hormuz, Russia-Ukraine, Israel, Taiwan and tariffs (July 2024 to October 2026, $3.6 billion in volume) and minute bars for oil, energy, defense, Treasury, gold and equity ETFs, I find that the answer depends on whether both venues are open. When US ETFs are closed, the move in Polymarket’s odds on Iran and Hormuz contracts predicts the oil ETF’s gap at the next open (USO t = 4.4 over 445 closures with errors clustered by closure; overnight and weekend closures replicate separately; control contracts and a shuffle placebo are null). When both venues are trading, the direction reverses: oil has moved 42 basis points in the 15 minutes before a Polymarket jump (t = 6.3) against 12 basis points in the 30 minutes after, and Granger tests run from oil to Polymarket in 24 percent of contract pairs against 8 percent in the other direction, with a cross-correlation peak at a 3 minute oil lead. The reopen gap is realized at the opening print; a rule that follows closed-hours jumps into USO at the open loses 15 basis points per trade. Prediction markets are not faster than oil futures. They are open when oil futures are not. This reconciles the election-night lead reported by Aktug and Torul (2026) with the weak daily transmission in Azqueta-Gavaldón and Ureta (2026): the lead is a trading-hours effect and the transmission is concentrated in the first minute after the open.</w:t>
+        <w:t xml:space="preserve">Do prediction markets lead conventional financial markets on geopolitical events? Using minute-level prices for 81 Polymarket contracts on the US-Iran conflict, the Strait of Hormuz, Russia-Ukraine, Israel, Venezuela, Taiwan and tariffs (2024 to October 2026, $3.1 billion in volume) and minute bars for oil, energy, defense, Treasury, gold and equity ETFs, I find that the answer depends on whether both venues are open. When US ETFs are closed, the move in Polymarket’s odds on Iran and Hormuz contracts predicts the oil ETF’s gap at the next open (USO t = 4.5 over 445 closures with errors clustered by closure; overnight and weekend closures replicate separately; control contracts and a shuffle placebo are null). When both venues are trading, the direction reverses: oil has moved 42 basis points in the 15 minutes before a Polymarket jump (t = 6.3) against 12 basis points in the 30 minutes after, and Granger tests run from oil to Polymarket in 24 percent of contract pairs against 8 percent in the other direction, with a cross-correlation peak at a 3 minute oil lead. The reopen gap is realized at the opening print; a rule that follows closed-hours jumps into USO at the open loses 15 basis points per trade. Prediction markets are not faster than oil futures. They are open when oil futures are not. This reconciles the election-night lead reported by Aktug and Torul (2026) with the weak daily transmission in Azqueta-Gavaldón and Ureta (2026): the lead is a trading-hours effect and the transmission is concentrated in the first minute after the open.</w:t>
       </w:r>
     </w:p>
     <w:bookmarkEnd w:id="20"/>
@@ -218,7 +218,7 @@
         <w:pStyle w:val="BodyText"/>
       </w:pPr>
       <w:r>
-        <w:t xml:space="preserve">This paper tests that directly. I assemble 67 Polymarket contracts on geopolitical events, grouped into 40 distinct event clusters, with minute-resolution price histories, and align them with minute bars for nine ETFs. Four designs separate the closed-hours case from the open-hours case. The closed-hours design regresses each ETF’s reopen return on the Polymarket move accumulated during the closure, so simultaneity is impossible by construction. The open-hours design is an event study around Polymarket jumps during ETF trading hours, where the pre-jump window asks whether the ETF had already moved. Granger causality and transfer entropy on overlapping minutes give the direction. A backtest gives economic significance.</w:t>
+        <w:t xml:space="preserve">This paper tests that directly. I assemble 81 Polymarket contracts on geopolitical events, grouped into 50 distinct event clusters, with minute-resolution price histories, and align them with minute bars for nine ETFs. Four designs separate the closed-hours case from the open-hours case. The closed-hours design regresses each ETF’s reopen return on the Polymarket move accumulated during the closure, so simultaneity is impossible by construction. The open-hours design is an event study around Polymarket jumps during ETF trading hours, where the pre-jump window asks whether the ETF had already moved. Granger causality and transfer entropy on overlapping minutes give the direction. A backtest gives economic significance.</w:t>
       </w:r>
     </w:p>
     <w:p>
@@ -253,7 +253,7 @@
         <w:pStyle w:val="FirstParagraph"/>
       </w:pPr>
       <w:r>
-        <w:t xml:space="preserve">Contracts were selected from the Polymarket Gamma API by topic tag (geopolitics, tariffs, Ukraine, Venezuela, oil) and ranked by volume. The sample contains 67 contracts with a plausible link to a traded asset and 9 control contracts (sports championships, entertainment releases) with no such link, chosen to have comparable volume and timing. Table A1 lists every contract. Many contracts are</w:t>
+        <w:t xml:space="preserve">Contracts were selected from the Polymarket Gamma API by topic tag (geopolitics, tariffs, Ukraine, Venezuela, oil) and ranked by volume. The sample contains 81 contracts with a plausible link to a traded asset and 10 control contracts (sports championships, entertainment releases) with no such link, chosen to have comparable volume and timing. Table A1 lists every contract. Many contracts are</w:t>
       </w:r>
       <w:r>
         <w:t xml:space="preserve"> </w:t>
@@ -298,7 +298,7 @@
         <w:t xml:space="preserve">”</w:t>
       </w:r>
       <w:r>
-        <w:t xml:space="preserve">); for inference these are grouped into event clusters defined by category, direction and the first three words of the question, giving 40 clusters among treated contracts.</w:t>
+        <w:t xml:space="preserve">); for inference these are grouped into event clusters defined by category, direction and the first three words of the question, giving 50 clusters among treated contracts.</w:t>
       </w:r>
     </w:p>
     <w:p>
@@ -358,7 +358,7 @@
         <w:pStyle w:val="FirstParagraph"/>
       </w:pPr>
       <w:r>
-        <w:t xml:space="preserve">Treated contracts produce 3,517 jumps by the detector described below, of which 72 percent occur while the ETFs are closed under the extended-hours definition. The 338 jumps of ten points or more are listed in the replication package with a template for headline timestamps (Section 6).</w:t>
+        <w:t xml:space="preserve">Treated contracts produce 4,367 jumps by the detector described below, of which 72 percent occur while the ETFs are closed under the extended-hours definition. The 430 jumps of ten points or more are listed in the replication package with a template for headline timestamps (Section 6).</w:t>
       </w:r>
     </w:p>
     <w:bookmarkEnd w:id="24"/>
@@ -740,7 +740,7 @@
               <w:jc w:val="left"/>
             </w:pPr>
             <w:r>
-              <w:t xml:space="preserve">1757</w:t>
+              <w:t xml:space="preserve">2305</w:t>
             </w:r>
           </w:p>
         </w:tc>
@@ -753,108 +753,6 @@
             </w:pPr>
             <w:r>
               <w:t xml:space="preserve">466</w:t>
-            </w:r>
-          </w:p>
-        </w:tc>
-        <w:tc>
-          <w:tcPr/>
-          <w:p>
-            <w:pPr>
-              <w:pStyle w:val="Compact"/>
-              <w:jc w:val="left"/>
-            </w:pPr>
-            <w:r>
-              <w:rPr>
-                <w:bCs/>
-                <w:b/>
-              </w:rPr>
-              <w:t xml:space="preserve">4.17</w:t>
-            </w:r>
-          </w:p>
-        </w:tc>
-        <w:tc>
-          <w:tcPr/>
-          <w:p>
-            <w:pPr>
-              <w:pStyle w:val="Compact"/>
-              <w:jc w:val="left"/>
-            </w:pPr>
-            <w:r>
-              <w:t xml:space="preserve">1687</w:t>
-            </w:r>
-          </w:p>
-        </w:tc>
-        <w:tc>
-          <w:tcPr/>
-          <w:p>
-            <w:pPr>
-              <w:pStyle w:val="Compact"/>
-              <w:jc w:val="left"/>
-            </w:pPr>
-            <w:r>
-              <w:t xml:space="preserve">445</w:t>
-            </w:r>
-          </w:p>
-        </w:tc>
-        <w:tc>
-          <w:tcPr/>
-          <w:p>
-            <w:pPr>
-              <w:pStyle w:val="Compact"/>
-              <w:jc w:val="left"/>
-            </w:pPr>
-            <w:r>
-              <w:rPr>
-                <w:bCs/>
-                <w:b/>
-              </w:rPr>
-              <w:t xml:space="preserve">4.38</w:t>
-            </w:r>
-          </w:p>
-        </w:tc>
-      </w:tr>
-      <w:tr>
-        <w:tc>
-          <w:tcPr/>
-          <w:p>
-            <w:pPr>
-              <w:pStyle w:val="Compact"/>
-              <w:jc w:val="left"/>
-            </w:pPr>
-            <w:r>
-              <w:t xml:space="preserve">XLE</w:t>
-            </w:r>
-          </w:p>
-        </w:tc>
-        <w:tc>
-          <w:tcPr/>
-          <w:p>
-            <w:pPr>
-              <w:pStyle w:val="Compact"/>
-            </w:pPr>
-          </w:p>
-        </w:tc>
-        <w:tc>
-          <w:tcPr/>
-          <w:p>
-            <w:pPr>
-              <w:pStyle w:val="Compact"/>
-              <w:jc w:val="left"/>
-            </w:pPr>
-            <w:r>
-              <w:t xml:space="preserve">1836</w:t>
-            </w:r>
-          </w:p>
-        </w:tc>
-        <w:tc>
-          <w:tcPr/>
-          <w:p>
-            <w:pPr>
-              <w:pStyle w:val="Compact"/>
-              <w:jc w:val="left"/>
-            </w:pPr>
-            <w:r>
-              <w:t xml:space="preserve">485</w:t>
             </w:r>
           </w:p>
         </w:tc>
@@ -882,7 +780,7 @@
               <w:jc w:val="left"/>
             </w:pPr>
             <w:r>
-              <w:t xml:space="preserve">1687</w:t>
+              <w:t xml:space="preserve">2204</w:t>
             </w:r>
           </w:p>
         </w:tc>
@@ -910,7 +808,7 @@
                 <w:bCs/>
                 <w:b/>
               </w:rPr>
-              <w:t xml:space="preserve">4.04</w:t>
+              <w:t xml:space="preserve">4.47</w:t>
             </w:r>
           </w:p>
         </w:tc>
@@ -924,63 +822,67 @@
               <w:jc w:val="left"/>
             </w:pPr>
             <w:r>
-              <w:t xml:space="preserve">TLT</w:t>
-            </w:r>
-          </w:p>
-        </w:tc>
-        <w:tc>
-          <w:tcPr/>
-          <w:p>
-            <w:pPr>
-              <w:pStyle w:val="Compact"/>
-            </w:pPr>
-          </w:p>
-        </w:tc>
-        <w:tc>
-          <w:tcPr/>
-          <w:p>
-            <w:pPr>
-              <w:pStyle w:val="Compact"/>
-              <w:jc w:val="left"/>
-            </w:pPr>
-            <w:r>
-              <w:t xml:space="preserve">2226</w:t>
-            </w:r>
-          </w:p>
-        </w:tc>
-        <w:tc>
-          <w:tcPr/>
-          <w:p>
-            <w:pPr>
-              <w:pStyle w:val="Compact"/>
-              <w:jc w:val="left"/>
-            </w:pPr>
-            <w:r>
-              <w:t xml:space="preserve">450</w:t>
-            </w:r>
-          </w:p>
-        </w:tc>
-        <w:tc>
-          <w:tcPr/>
-          <w:p>
-            <w:pPr>
-              <w:pStyle w:val="Compact"/>
-              <w:jc w:val="left"/>
-            </w:pPr>
-            <w:r>
-              <w:t xml:space="preserve">-2.43</w:t>
-            </w:r>
-          </w:p>
-        </w:tc>
-        <w:tc>
-          <w:tcPr/>
-          <w:p>
-            <w:pPr>
-              <w:pStyle w:val="Compact"/>
-              <w:jc w:val="left"/>
-            </w:pPr>
-            <w:r>
-              <w:t xml:space="preserve">2185</w:t>
+              <w:t xml:space="preserve">XLE</w:t>
+            </w:r>
+          </w:p>
+        </w:tc>
+        <w:tc>
+          <w:tcPr/>
+          <w:p>
+            <w:pPr>
+              <w:pStyle w:val="Compact"/>
+            </w:pPr>
+          </w:p>
+        </w:tc>
+        <w:tc>
+          <w:tcPr/>
+          <w:p>
+            <w:pPr>
+              <w:pStyle w:val="Compact"/>
+              <w:jc w:val="left"/>
+            </w:pPr>
+            <w:r>
+              <w:t xml:space="preserve">2426</w:t>
+            </w:r>
+          </w:p>
+        </w:tc>
+        <w:tc>
+          <w:tcPr/>
+          <w:p>
+            <w:pPr>
+              <w:pStyle w:val="Compact"/>
+              <w:jc w:val="left"/>
+            </w:pPr>
+            <w:r>
+              <w:t xml:space="preserve">485</w:t>
+            </w:r>
+          </w:p>
+        </w:tc>
+        <w:tc>
+          <w:tcPr/>
+          <w:p>
+            <w:pPr>
+              <w:pStyle w:val="Compact"/>
+              <w:jc w:val="left"/>
+            </w:pPr>
+            <w:r>
+              <w:rPr>
+                <w:bCs/>
+                <w:b/>
+              </w:rPr>
+              <w:t xml:space="preserve">3.75</w:t>
+            </w:r>
+          </w:p>
+        </w:tc>
+        <w:tc>
+          <w:tcPr/>
+          <w:p>
+            <w:pPr>
+              <w:pStyle w:val="Compact"/>
+              <w:jc w:val="left"/>
+            </w:pPr>
+            <w:r>
+              <w:t xml:space="preserve">2204</w:t>
             </w:r>
           </w:p>
         </w:tc>
@@ -1004,7 +906,11 @@
               <w:jc w:val="left"/>
             </w:pPr>
             <w:r>
-              <w:t xml:space="preserve">-2.76</w:t>
+              <w:rPr>
+                <w:bCs/>
+                <w:b/>
+              </w:rPr>
+              <w:t xml:space="preserve">3.97</w:t>
             </w:r>
           </w:p>
         </w:tc>
@@ -1018,63 +924,63 @@
               <w:jc w:val="left"/>
             </w:pPr>
             <w:r>
-              <w:t xml:space="preserve">SPY</w:t>
-            </w:r>
-          </w:p>
-        </w:tc>
-        <w:tc>
-          <w:tcPr/>
-          <w:p>
-            <w:pPr>
-              <w:pStyle w:val="Compact"/>
-            </w:pPr>
-          </w:p>
-        </w:tc>
-        <w:tc>
-          <w:tcPr/>
-          <w:p>
-            <w:pPr>
-              <w:pStyle w:val="Compact"/>
-              <w:jc w:val="left"/>
-            </w:pPr>
-            <w:r>
-              <w:t xml:space="preserve">2226</w:t>
-            </w:r>
-          </w:p>
-        </w:tc>
-        <w:tc>
-          <w:tcPr/>
-          <w:p>
-            <w:pPr>
-              <w:pStyle w:val="Compact"/>
-              <w:jc w:val="left"/>
-            </w:pPr>
-            <w:r>
-              <w:t xml:space="preserve">450</w:t>
-            </w:r>
-          </w:p>
-        </w:tc>
-        <w:tc>
-          <w:tcPr/>
-          <w:p>
-            <w:pPr>
-              <w:pStyle w:val="Compact"/>
-              <w:jc w:val="left"/>
-            </w:pPr>
-            <w:r>
-              <w:t xml:space="preserve">1.43</w:t>
-            </w:r>
-          </w:p>
-        </w:tc>
-        <w:tc>
-          <w:tcPr/>
-          <w:p>
-            <w:pPr>
-              <w:pStyle w:val="Compact"/>
-              <w:jc w:val="left"/>
-            </w:pPr>
-            <w:r>
-              <w:t xml:space="preserve">2185</w:t>
+              <w:t xml:space="preserve">VIXY</w:t>
+            </w:r>
+          </w:p>
+        </w:tc>
+        <w:tc>
+          <w:tcPr/>
+          <w:p>
+            <w:pPr>
+              <w:pStyle w:val="Compact"/>
+            </w:pPr>
+          </w:p>
+        </w:tc>
+        <w:tc>
+          <w:tcPr/>
+          <w:p>
+            <w:pPr>
+              <w:pStyle w:val="Compact"/>
+              <w:jc w:val="left"/>
+            </w:pPr>
+            <w:r>
+              <w:t xml:space="preserve">3345</w:t>
+            </w:r>
+          </w:p>
+        </w:tc>
+        <w:tc>
+          <w:tcPr/>
+          <w:p>
+            <w:pPr>
+              <w:pStyle w:val="Compact"/>
+              <w:jc w:val="left"/>
+            </w:pPr>
+            <w:r>
+              <w:t xml:space="preserve">478</w:t>
+            </w:r>
+          </w:p>
+        </w:tc>
+        <w:tc>
+          <w:tcPr/>
+          <w:p>
+            <w:pPr>
+              <w:pStyle w:val="Compact"/>
+              <w:jc w:val="left"/>
+            </w:pPr>
+            <w:r>
+              <w:t xml:space="preserve">3.06</w:t>
+            </w:r>
+          </w:p>
+        </w:tc>
+        <w:tc>
+          <w:tcPr/>
+          <w:p>
+            <w:pPr>
+              <w:pStyle w:val="Compact"/>
+              <w:jc w:val="left"/>
+            </w:pPr>
+            <w:r>
+              <w:t xml:space="preserve">3088</w:t>
             </w:r>
           </w:p>
         </w:tc>
@@ -1098,7 +1004,7 @@
               <w:jc w:val="left"/>
             </w:pPr>
             <w:r>
-              <w:t xml:space="preserve">1.93</w:t>
+              <w:t xml:space="preserve">2.66</w:t>
             </w:r>
           </w:p>
         </w:tc>
@@ -1112,76 +1018,88 @@
               <w:jc w:val="left"/>
             </w:pPr>
             <w:r>
-              <w:t xml:space="preserve">GLD</w:t>
-            </w:r>
-          </w:p>
-        </w:tc>
-        <w:tc>
-          <w:tcPr/>
-          <w:p>
-            <w:pPr>
-              <w:pStyle w:val="Compact"/>
-            </w:pPr>
-          </w:p>
-        </w:tc>
-        <w:tc>
-          <w:tcPr/>
-          <w:p>
-            <w:pPr>
-              <w:pStyle w:val="Compact"/>
-              <w:jc w:val="left"/>
-            </w:pPr>
-            <w:r>
-              <w:t xml:space="preserve">2232</w:t>
-            </w:r>
-          </w:p>
-        </w:tc>
-        <w:tc>
-          <w:tcPr/>
-          <w:p>
-            <w:pPr>
-              <w:pStyle w:val="Compact"/>
-              <w:jc w:val="left"/>
-            </w:pPr>
-            <w:r>
-              <w:t xml:space="preserve">452</w:t>
-            </w:r>
-          </w:p>
-        </w:tc>
-        <w:tc>
-          <w:tcPr/>
-          <w:p>
-            <w:pPr>
-              <w:pStyle w:val="Compact"/>
-              <w:jc w:val="left"/>
-            </w:pPr>
-            <w:r>
-              <w:t xml:space="preserve">-0.23</w:t>
-            </w:r>
-          </w:p>
-        </w:tc>
-        <w:tc>
-          <w:tcPr/>
-          <w:p>
-            <w:pPr>
-              <w:pStyle w:val="Compact"/>
-            </w:pPr>
-          </w:p>
-        </w:tc>
-        <w:tc>
-          <w:tcPr/>
-          <w:p>
-            <w:pPr>
-              <w:pStyle w:val="Compact"/>
-            </w:pPr>
-          </w:p>
-        </w:tc>
-        <w:tc>
-          <w:tcPr/>
-          <w:p>
-            <w:pPr>
-              <w:pStyle w:val="Compact"/>
-            </w:pPr>
+              <w:t xml:space="preserve">TLT</w:t>
+            </w:r>
+          </w:p>
+        </w:tc>
+        <w:tc>
+          <w:tcPr/>
+          <w:p>
+            <w:pPr>
+              <w:pStyle w:val="Compact"/>
+            </w:pPr>
+          </w:p>
+        </w:tc>
+        <w:tc>
+          <w:tcPr/>
+          <w:p>
+            <w:pPr>
+              <w:pStyle w:val="Compact"/>
+              <w:jc w:val="left"/>
+            </w:pPr>
+            <w:r>
+              <w:t xml:space="preserve">3152</w:t>
+            </w:r>
+          </w:p>
+        </w:tc>
+        <w:tc>
+          <w:tcPr/>
+          <w:p>
+            <w:pPr>
+              <w:pStyle w:val="Compact"/>
+              <w:jc w:val="left"/>
+            </w:pPr>
+            <w:r>
+              <w:t xml:space="preserve">450</w:t>
+            </w:r>
+          </w:p>
+        </w:tc>
+        <w:tc>
+          <w:tcPr/>
+          <w:p>
+            <w:pPr>
+              <w:pStyle w:val="Compact"/>
+              <w:jc w:val="left"/>
+            </w:pPr>
+            <w:r>
+              <w:t xml:space="preserve">-1.36</w:t>
+            </w:r>
+          </w:p>
+        </w:tc>
+        <w:tc>
+          <w:tcPr/>
+          <w:p>
+            <w:pPr>
+              <w:pStyle w:val="Compact"/>
+              <w:jc w:val="left"/>
+            </w:pPr>
+            <w:r>
+              <w:t xml:space="preserve">3088</w:t>
+            </w:r>
+          </w:p>
+        </w:tc>
+        <w:tc>
+          <w:tcPr/>
+          <w:p>
+            <w:pPr>
+              <w:pStyle w:val="Compact"/>
+              <w:jc w:val="left"/>
+            </w:pPr>
+            <w:r>
+              <w:t xml:space="preserve">445</w:t>
+            </w:r>
+          </w:p>
+        </w:tc>
+        <w:tc>
+          <w:tcPr/>
+          <w:p>
+            <w:pPr>
+              <w:pStyle w:val="Compact"/>
+              <w:jc w:val="left"/>
+            </w:pPr>
+            <w:r>
+              <w:t xml:space="preserve">-2.35</w:t>
+            </w:r>
           </w:p>
         </w:tc>
       </w:tr>
@@ -1194,76 +1112,88 @@
               <w:jc w:val="left"/>
             </w:pPr>
             <w:r>
-              <w:t xml:space="preserve">ITA</w:t>
-            </w:r>
-          </w:p>
-        </w:tc>
-        <w:tc>
-          <w:tcPr/>
-          <w:p>
-            <w:pPr>
-              <w:pStyle w:val="Compact"/>
-            </w:pPr>
-          </w:p>
-        </w:tc>
-        <w:tc>
-          <w:tcPr/>
-          <w:p>
-            <w:pPr>
-              <w:pStyle w:val="Compact"/>
-              <w:jc w:val="left"/>
-            </w:pPr>
-            <w:r>
-              <w:t xml:space="preserve">3200</w:t>
-            </w:r>
-          </w:p>
-        </w:tc>
-        <w:tc>
-          <w:tcPr/>
-          <w:p>
-            <w:pPr>
-              <w:pStyle w:val="Compact"/>
-              <w:jc w:val="left"/>
-            </w:pPr>
-            <w:r>
-              <w:t xml:space="preserve">672</w:t>
-            </w:r>
-          </w:p>
-        </w:tc>
-        <w:tc>
-          <w:tcPr/>
-          <w:p>
-            <w:pPr>
-              <w:pStyle w:val="Compact"/>
-              <w:jc w:val="left"/>
-            </w:pPr>
-            <w:r>
-              <w:t xml:space="preserve">-0.86</w:t>
-            </w:r>
-          </w:p>
-        </w:tc>
-        <w:tc>
-          <w:tcPr/>
-          <w:p>
-            <w:pPr>
-              <w:pStyle w:val="Compact"/>
-            </w:pPr>
-          </w:p>
-        </w:tc>
-        <w:tc>
-          <w:tcPr/>
-          <w:p>
-            <w:pPr>
-              <w:pStyle w:val="Compact"/>
-            </w:pPr>
-          </w:p>
-        </w:tc>
-        <w:tc>
-          <w:tcPr/>
-          <w:p>
-            <w:pPr>
-              <w:pStyle w:val="Compact"/>
-            </w:pPr>
+              <w:t xml:space="preserve">SPY</w:t>
+            </w:r>
+          </w:p>
+        </w:tc>
+        <w:tc>
+          <w:tcPr/>
+          <w:p>
+            <w:pPr>
+              <w:pStyle w:val="Compact"/>
+            </w:pPr>
+          </w:p>
+        </w:tc>
+        <w:tc>
+          <w:tcPr/>
+          <w:p>
+            <w:pPr>
+              <w:pStyle w:val="Compact"/>
+              <w:jc w:val="left"/>
+            </w:pPr>
+            <w:r>
+              <w:t xml:space="preserve">3152</w:t>
+            </w:r>
+          </w:p>
+        </w:tc>
+        <w:tc>
+          <w:tcPr/>
+          <w:p>
+            <w:pPr>
+              <w:pStyle w:val="Compact"/>
+              <w:jc w:val="left"/>
+            </w:pPr>
+            <w:r>
+              <w:t xml:space="preserve">450</w:t>
+            </w:r>
+          </w:p>
+        </w:tc>
+        <w:tc>
+          <w:tcPr/>
+          <w:p>
+            <w:pPr>
+              <w:pStyle w:val="Compact"/>
+              <w:jc w:val="left"/>
+            </w:pPr>
+            <w:r>
+              <w:t xml:space="preserve">2.01</w:t>
+            </w:r>
+          </w:p>
+        </w:tc>
+        <w:tc>
+          <w:tcPr/>
+          <w:p>
+            <w:pPr>
+              <w:pStyle w:val="Compact"/>
+              <w:jc w:val="left"/>
+            </w:pPr>
+            <w:r>
+              <w:t xml:space="preserve">3088</w:t>
+            </w:r>
+          </w:p>
+        </w:tc>
+        <w:tc>
+          <w:tcPr/>
+          <w:p>
+            <w:pPr>
+              <w:pStyle w:val="Compact"/>
+              <w:jc w:val="left"/>
+            </w:pPr>
+            <w:r>
+              <w:t xml:space="preserve">445</w:t>
+            </w:r>
+          </w:p>
+        </w:tc>
+        <w:tc>
+          <w:tcPr/>
+          <w:p>
+            <w:pPr>
+              <w:pStyle w:val="Compact"/>
+              <w:jc w:val="left"/>
+            </w:pPr>
+            <w:r>
+              <w:t xml:space="preserve">1.97</w:t>
+            </w:r>
           </w:p>
         </w:tc>
       </w:tr>
@@ -1276,76 +1206,88 @@
               <w:jc w:val="left"/>
             </w:pPr>
             <w:r>
-              <w:t xml:space="preserve">LMT</w:t>
-            </w:r>
-          </w:p>
-        </w:tc>
-        <w:tc>
-          <w:tcPr/>
-          <w:p>
-            <w:pPr>
-              <w:pStyle w:val="Compact"/>
-            </w:pPr>
-          </w:p>
-        </w:tc>
-        <w:tc>
-          <w:tcPr/>
-          <w:p>
-            <w:pPr>
-              <w:pStyle w:val="Compact"/>
-              <w:jc w:val="left"/>
-            </w:pPr>
-            <w:r>
-              <w:t xml:space="preserve">2951</w:t>
-            </w:r>
-          </w:p>
-        </w:tc>
-        <w:tc>
-          <w:tcPr/>
-          <w:p>
-            <w:pPr>
-              <w:pStyle w:val="Compact"/>
-              <w:jc w:val="left"/>
-            </w:pPr>
-            <w:r>
-              <w:t xml:space="preserve">640</w:t>
-            </w:r>
-          </w:p>
-        </w:tc>
-        <w:tc>
-          <w:tcPr/>
-          <w:p>
-            <w:pPr>
-              <w:pStyle w:val="Compact"/>
-              <w:jc w:val="left"/>
-            </w:pPr>
-            <w:r>
-              <w:t xml:space="preserve">1.04</w:t>
-            </w:r>
-          </w:p>
-        </w:tc>
-        <w:tc>
-          <w:tcPr/>
-          <w:p>
-            <w:pPr>
-              <w:pStyle w:val="Compact"/>
-            </w:pPr>
-          </w:p>
-        </w:tc>
-        <w:tc>
-          <w:tcPr/>
-          <w:p>
-            <w:pPr>
-              <w:pStyle w:val="Compact"/>
-            </w:pPr>
-          </w:p>
-        </w:tc>
-        <w:tc>
-          <w:tcPr/>
-          <w:p>
-            <w:pPr>
-              <w:pStyle w:val="Compact"/>
-            </w:pPr>
+              <w:t xml:space="preserve">GLD</w:t>
+            </w:r>
+          </w:p>
+        </w:tc>
+        <w:tc>
+          <w:tcPr/>
+          <w:p>
+            <w:pPr>
+              <w:pStyle w:val="Compact"/>
+            </w:pPr>
+          </w:p>
+        </w:tc>
+        <w:tc>
+          <w:tcPr/>
+          <w:p>
+            <w:pPr>
+              <w:pStyle w:val="Compact"/>
+              <w:jc w:val="left"/>
+            </w:pPr>
+            <w:r>
+              <w:t xml:space="preserve">3162</w:t>
+            </w:r>
+          </w:p>
+        </w:tc>
+        <w:tc>
+          <w:tcPr/>
+          <w:p>
+            <w:pPr>
+              <w:pStyle w:val="Compact"/>
+              <w:jc w:val="left"/>
+            </w:pPr>
+            <w:r>
+              <w:t xml:space="preserve">452</w:t>
+            </w:r>
+          </w:p>
+        </w:tc>
+        <w:tc>
+          <w:tcPr/>
+          <w:p>
+            <w:pPr>
+              <w:pStyle w:val="Compact"/>
+              <w:jc w:val="left"/>
+            </w:pPr>
+            <w:r>
+              <w:t xml:space="preserve">-0.11</w:t>
+            </w:r>
+          </w:p>
+        </w:tc>
+        <w:tc>
+          <w:tcPr/>
+          <w:p>
+            <w:pPr>
+              <w:pStyle w:val="Compact"/>
+              <w:jc w:val="left"/>
+            </w:pPr>
+            <w:r>
+              <w:t xml:space="preserve">3088</w:t>
+            </w:r>
+          </w:p>
+        </w:tc>
+        <w:tc>
+          <w:tcPr/>
+          <w:p>
+            <w:pPr>
+              <w:pStyle w:val="Compact"/>
+              <w:jc w:val="left"/>
+            </w:pPr>
+            <w:r>
+              <w:t xml:space="preserve">445</w:t>
+            </w:r>
+          </w:p>
+        </w:tc>
+        <w:tc>
+          <w:tcPr/>
+          <w:p>
+            <w:pPr>
+              <w:pStyle w:val="Compact"/>
+              <w:jc w:val="left"/>
+            </w:pPr>
+            <w:r>
+              <w:t xml:space="preserve">-1.14</w:t>
+            </w:r>
           </w:p>
         </w:tc>
       </w:tr>
@@ -1358,6 +1300,194 @@
               <w:jc w:val="left"/>
             </w:pPr>
             <w:r>
+              <w:t xml:space="preserve">ITA</w:t>
+            </w:r>
+          </w:p>
+        </w:tc>
+        <w:tc>
+          <w:tcPr/>
+          <w:p>
+            <w:pPr>
+              <w:pStyle w:val="Compact"/>
+            </w:pPr>
+          </w:p>
+        </w:tc>
+        <w:tc>
+          <w:tcPr/>
+          <w:p>
+            <w:pPr>
+              <w:pStyle w:val="Compact"/>
+              <w:jc w:val="left"/>
+            </w:pPr>
+            <w:r>
+              <w:t xml:space="preserve">4018</w:t>
+            </w:r>
+          </w:p>
+        </w:tc>
+        <w:tc>
+          <w:tcPr/>
+          <w:p>
+            <w:pPr>
+              <w:pStyle w:val="Compact"/>
+              <w:jc w:val="left"/>
+            </w:pPr>
+            <w:r>
+              <w:t xml:space="preserve">672</w:t>
+            </w:r>
+          </w:p>
+        </w:tc>
+        <w:tc>
+          <w:tcPr/>
+          <w:p>
+            <w:pPr>
+              <w:pStyle w:val="Compact"/>
+              <w:jc w:val="left"/>
+            </w:pPr>
+            <w:r>
+              <w:t xml:space="preserve">-1.00</w:t>
+            </w:r>
+          </w:p>
+        </w:tc>
+        <w:tc>
+          <w:tcPr/>
+          <w:p>
+            <w:pPr>
+              <w:pStyle w:val="Compact"/>
+              <w:jc w:val="left"/>
+            </w:pPr>
+            <w:r>
+              <w:t xml:space="preserve">2608</w:t>
+            </w:r>
+          </w:p>
+        </w:tc>
+        <w:tc>
+          <w:tcPr/>
+          <w:p>
+            <w:pPr>
+              <w:pStyle w:val="Compact"/>
+              <w:jc w:val="left"/>
+            </w:pPr>
+            <w:r>
+              <w:t xml:space="preserve">445</w:t>
+            </w:r>
+          </w:p>
+        </w:tc>
+        <w:tc>
+          <w:tcPr/>
+          <w:p>
+            <w:pPr>
+              <w:pStyle w:val="Compact"/>
+              <w:jc w:val="left"/>
+            </w:pPr>
+            <w:r>
+              <w:t xml:space="preserve">-1.94</w:t>
+            </w:r>
+          </w:p>
+        </w:tc>
+      </w:tr>
+      <w:tr>
+        <w:tc>
+          <w:tcPr/>
+          <w:p>
+            <w:pPr>
+              <w:pStyle w:val="Compact"/>
+              <w:jc w:val="left"/>
+            </w:pPr>
+            <w:r>
+              <w:t xml:space="preserve">LMT</w:t>
+            </w:r>
+          </w:p>
+        </w:tc>
+        <w:tc>
+          <w:tcPr/>
+          <w:p>
+            <w:pPr>
+              <w:pStyle w:val="Compact"/>
+            </w:pPr>
+          </w:p>
+        </w:tc>
+        <w:tc>
+          <w:tcPr/>
+          <w:p>
+            <w:pPr>
+              <w:pStyle w:val="Compact"/>
+              <w:jc w:val="left"/>
+            </w:pPr>
+            <w:r>
+              <w:t xml:space="preserve">3820</w:t>
+            </w:r>
+          </w:p>
+        </w:tc>
+        <w:tc>
+          <w:tcPr/>
+          <w:p>
+            <w:pPr>
+              <w:pStyle w:val="Compact"/>
+              <w:jc w:val="left"/>
+            </w:pPr>
+            <w:r>
+              <w:t xml:space="preserve">640</w:t>
+            </w:r>
+          </w:p>
+        </w:tc>
+        <w:tc>
+          <w:tcPr/>
+          <w:p>
+            <w:pPr>
+              <w:pStyle w:val="Compact"/>
+              <w:jc w:val="left"/>
+            </w:pPr>
+            <w:r>
+              <w:t xml:space="preserve">0.92</w:t>
+            </w:r>
+          </w:p>
+        </w:tc>
+        <w:tc>
+          <w:tcPr/>
+          <w:p>
+            <w:pPr>
+              <w:pStyle w:val="Compact"/>
+              <w:jc w:val="left"/>
+            </w:pPr>
+            <w:r>
+              <w:t xml:space="preserve">2608</w:t>
+            </w:r>
+          </w:p>
+        </w:tc>
+        <w:tc>
+          <w:tcPr/>
+          <w:p>
+            <w:pPr>
+              <w:pStyle w:val="Compact"/>
+              <w:jc w:val="left"/>
+            </w:pPr>
+            <w:r>
+              <w:t xml:space="preserve">445</w:t>
+            </w:r>
+          </w:p>
+        </w:tc>
+        <w:tc>
+          <w:tcPr/>
+          <w:p>
+            <w:pPr>
+              <w:pStyle w:val="Compact"/>
+              <w:jc w:val="left"/>
+            </w:pPr>
+            <w:r>
+              <w:t xml:space="preserve">1.23</w:t>
+            </w:r>
+          </w:p>
+        </w:tc>
+      </w:tr>
+      <w:tr>
+        <w:tc>
+          <w:tcPr/>
+          <w:p>
+            <w:pPr>
+              <w:pStyle w:val="Compact"/>
+              <w:jc w:val="left"/>
+            </w:pPr>
+            <w:r>
               <w:t xml:space="preserve">RTX</w:t>
             </w:r>
           </w:p>
@@ -1378,7 +1508,7 @@
               <w:jc w:val="left"/>
             </w:pPr>
             <w:r>
-              <w:t xml:space="preserve">2876</w:t>
+              <w:t xml:space="preserve">3699</w:t>
             </w:r>
           </w:p>
         </w:tc>
@@ -1402,32 +1532,44 @@
               <w:jc w:val="left"/>
             </w:pPr>
             <w:r>
-              <w:t xml:space="preserve">0.70</w:t>
-            </w:r>
-          </w:p>
-        </w:tc>
-        <w:tc>
-          <w:tcPr/>
-          <w:p>
-            <w:pPr>
-              <w:pStyle w:val="Compact"/>
-            </w:pPr>
-          </w:p>
-        </w:tc>
-        <w:tc>
-          <w:tcPr/>
-          <w:p>
-            <w:pPr>
-              <w:pStyle w:val="Compact"/>
-            </w:pPr>
-          </w:p>
-        </w:tc>
-        <w:tc>
-          <w:tcPr/>
-          <w:p>
-            <w:pPr>
-              <w:pStyle w:val="Compact"/>
-            </w:pPr>
+              <w:t xml:space="preserve">0.45</w:t>
+            </w:r>
+          </w:p>
+        </w:tc>
+        <w:tc>
+          <w:tcPr/>
+          <w:p>
+            <w:pPr>
+              <w:pStyle w:val="Compact"/>
+              <w:jc w:val="left"/>
+            </w:pPr>
+            <w:r>
+              <w:t xml:space="preserve">2608</w:t>
+            </w:r>
+          </w:p>
+        </w:tc>
+        <w:tc>
+          <w:tcPr/>
+          <w:p>
+            <w:pPr>
+              <w:pStyle w:val="Compact"/>
+              <w:jc w:val="left"/>
+            </w:pPr>
+            <w:r>
+              <w:t xml:space="preserve">445</w:t>
+            </w:r>
+          </w:p>
+        </w:tc>
+        <w:tc>
+          <w:tcPr/>
+          <w:p>
+            <w:pPr>
+              <w:pStyle w:val="Compact"/>
+              <w:jc w:val="left"/>
+            </w:pPr>
+            <w:r>
+              <w:t xml:space="preserve">-0.40</w:t>
+            </w:r>
           </w:p>
         </w:tc>
       </w:tr>
@@ -1437,7 +1579,7 @@
         <w:pStyle w:val="BodyText"/>
       </w:pPr>
       <w:r>
-        <w:t xml:space="preserve">Slopes for USO are 0.012 (extended) and 0.017 (regular) in log return per unit of log-odds. Under the regular-hours definition, a contract moving from 50 to 73 percent during a closure predicts a 1.7 percent move in USO by 30 minutes after the open. The effect is present in the first minute of trading (USO t = 4.24 at h = 1). Overnight closures alone (345 clusters, t = 3.4) and weekend closures alone (100 clusters, t = 2.4) each replicate. The pre-closure control is insignificant for oil (t between -0.2 and 1.6).</w:t>
+        <w:t xml:space="preserve">Slopes for USO are 0.011 (extended) and 0.017 (regular) in log return per unit of log-odds. Under the regular-hours definition, a contract moving from 50 to 73 percent during a closure predicts a 1.7 percent move in USO by 30 minutes after the open. The effect is present in the first minute of trading (USO t = 4.09 at h = 1 under extended hours, 4.41 under regular hours). Overnight closures alone (345 clusters, t = 3.5) and weekend closures alone (100 clusters, t = 2.6) each replicate. The pre-closure control, the contract’s move in the twelve hours before the close, has t = 0.2 for USO under extended hours and 1.9 under regular hours; the closure slope is estimated net of it. VIXY, the volatility ETF, also responds (t = 3.1 extended, 2.7 regular), driven by the Venezuela contracts (t = 2.6) rather than the oil ones (t = 1.5 to 1.9).</w:t>
       </w:r>
     </w:p>
     <w:p>
@@ -1508,7 +1650,7 @@
         <w:pStyle w:val="BodyText"/>
       </w:pPr>
       <w:r>
-        <w:t xml:space="preserve">By category, the effect comes from the two groups of contracts about oil supply. Iran contracts give XLE t = 3.7 and USO t = 3.6 over 224 clusters. Hormuz contracts give USO t = 3.9 with a slope of 0.028 over 105 clusters. Ukraine, Israel, Taiwan, tariff and other military contracts show nothing on any asset. Defense ETFs show nothing on any contract. Control contracts are null on every asset (largest |t| 0.9).</w:t>
+        <w:t xml:space="preserve">By category, the effect comes from the two groups of contracts about oil supply. Iran contracts give XLE t = 3.7 and USO t = 3.6 over 223 clusters. Hormuz contracts give USO t = 3.9 with a slope of 0.028 over 105 clusters. Ukraine, Israel, Taiwan, tariff and other military contracts show nothing on oil. Venezuela contracts show nothing on oil but move VIXY (t = 2.6) and SPY (t = 2.3). Defense ETFs show nothing on any contract. Control contracts are null on every asset (largest |t| 1.3).</w:t>
       </w:r>
     </w:p>
     <w:p>
@@ -1516,7 +1658,7 @@
         <w:pStyle w:val="BodyText"/>
       </w:pPr>
       <w:r>
-        <w:t xml:space="preserve">Two checks address the concern that both series were volatile in the same months. Permuting each contract’s closure moves across its own closures, which preserves the marginal distributions and destroys the pairing, leaves no asset significant (largest |t| 1.8). Regressing the contract’s closure move on the ETF’s return in the last hour before the close, the reverse direction, gives |t| below 0.8 for every asset.</w:t>
+        <w:t xml:space="preserve">Two checks address the concern that both series were volatile in the same months. Permuting each contract’s closure moves across its own closures, which preserves the marginal distributions and destroys the pairing, leaves oil and VIXY null (USO t = 0.8, XLE 1.8, VIXY -1.0; the largest placebo |t| across nine assets is 2.1, on ITA, which has no real effect). Regressing the contract’s closure move on the ETF’s return in the last hour before the close, the reverse direction, gives |t| below 1.6 for every asset.</w:t>
       </w:r>
     </w:p>
     <w:bookmarkEnd w:id="35"/>
@@ -2155,7 +2297,7 @@
         <w:pStyle w:val="FirstParagraph"/>
       </w:pPr>
       <w:r>
-        <w:t xml:space="preserve">Among Iran and Hormuz contract pairs with USO, Granger causality from oil to Polymarket is significant at 5 percent in 24 percent of pairs; from Polymarket to oil in 8 percent. Fisher’s combined p-value across all treated USO pairs is 1e-13 for oil to Polymarket and 0.045 for Polymarket to oil. The cross-correlation peak lag has a median of -3 minutes for USO and -2 for XLE, where negative means oil leads (Figure 3).</w:t>
+        <w:t xml:space="preserve">Among Iran and Hormuz contract pairs with USO, Granger causality from oil to Polymarket is significant at 5 percent in 24 percent of pairs; from Polymarket to oil in 8 percent. Fisher’s combined p-value across the 68 treated USO pairs is 1e-13 for oil to Polymarket and 0.06 for Polymarket to oil. The cross-correlation peak lag has a median of -3 minutes for USO and -2 for XLE, where negative means oil leads (Figure 3).</w:t>
       </w:r>
     </w:p>
     <w:p>
@@ -2226,7 +2368,7 @@
         <w:pStyle w:val="FirstParagraph"/>
       </w:pPr>
       <w:r>
-        <w:t xml:space="preserve">Following each closed-hours jump on an Iran or Hormuz contract into USO at the next open and holding 30 minutes yields a mean of -15.4 basis points per trade over 283 trades (t = -2.4), with a hit rate of 47 percent. Restricting to jumps of ten points or more does not help (-20 bp, 90 trades). Open-hours jumps entered one minute later yield +3 bp (t = 0.8). Control contracts yield nothing in either case.</w:t>
+        <w:t xml:space="preserve">Following each closed-hours jump on an Iran or Hormuz contract into USO at the next open and holding 30 minutes yields a mean of -15.4 basis points per trade over 283 trades (t = -2.4), with a hit rate of 47 percent. Restricting to jumps of ten points or more does not help (-20 bp, 90 trades). Open-hours jumps entered one minute later yield +7 bp (t = 1.3). Control contracts yield nothing in either case.</w:t>
       </w:r>
     </w:p>
     <w:p>
@@ -2269,7 +2411,7 @@
         <w:pStyle w:val="BodyText"/>
       </w:pPr>
       <w:r>
-        <w:t xml:space="preserve">Three caveats apply. First, the Polymarket series is a quote that moves only when the book moves, so on thin contracts the detected jump minute can lag the information minute by a few minutes. This biases the open-hours event study toward finding pre-jump ETF movement and biases against Polymarket leadership; it does not affect the closed-hours design, where the whole closure is the window. Second, the closed-hours result does not distinguish Polymarket aggregating public overnight news that oil could not trade on from Polymarket absorbing non-public information. The watchdog cases on military contracts are the second kind. Classifying each large closed-hours jump against the earliest public timestamp of its news would separate them; the replication package includes the template and this is the natural next step. This paper does not attribute any trade to any wallet. Third, the Iran contracts cluster in the first half of 2026 and the Hormuz contracts in its second quarter. The clustered standard errors treat each closure as one observation, but the events themselves are not independent of one another, and a reader who prefers to count 40 clusters rather than 445 closures should read the t-statistics with that in mind.</w:t>
+        <w:t xml:space="preserve">Three caveats apply. First, the Polymarket series is a quote that moves only when the book moves, so on thin contracts the detected jump minute can lag the information minute by a few minutes. This biases the open-hours event study toward finding pre-jump ETF movement and biases against Polymarket leadership; it does not affect the closed-hours design, where the whole closure is the window. Second, the closed-hours result does not distinguish Polymarket aggregating public overnight news that oil could not trade on from Polymarket absorbing non-public information. The watchdog cases on military contracts are the second kind. Classifying each large closed-hours jump against the earliest public timestamp of its news would separate them; the replication package includes the template and this is the natural next step. This paper does not attribute any trade to any wallet. Third, the Iran contracts cluster in the first half of 2026 and the Hormuz contracts in its second quarter. The clustered standard errors treat each closure as one observation, but the events themselves are not independent of one another, and a reader who prefers to count 50 clusters rather than 445 closures should read the t-statistics with that in mind.</w:t>
       </w:r>
     </w:p>
     <w:bookmarkEnd w:id="46"/>
@@ -2305,7 +2447,7 @@
         <w:pStyle w:val="FirstParagraph"/>
       </w:pPr>
       <w:r>
-        <w:t xml:space="preserve">Across 67 geopolitical contracts and 445 venue closures, Polymarket’s price moves while US markets are closed predict the oil ETF’s opening gap, and during trading hours oil moves first. The lead that prediction markets appear to have over conventional markets is the lead of a venue that never closes over one that does. It is real, it is concentrated in the contracts that carry oil-supply information, and it cannot be traded after the open.</w:t>
+        <w:t xml:space="preserve">Across 81 geopolitical contracts and 445 venue closures, Polymarket’s price moves while US markets are closed predict the oil ETF’s opening gap, and during trading hours oil moves first. The lead that prediction markets appear to have over conventional markets is the lead of a venue that never closes over one that does. It is real, it is concentrated in the contracts that carry oil-supply information, and it cannot be traded after the open.</w:t>
       </w:r>
     </w:p>
     <w:bookmarkEnd w:id="48"/>
@@ -2452,7 +2594,7 @@
         <w:rPr>
           <w:rStyle w:val="VerbatimChar"/>
         </w:rPr>
-        <w:t xml:space="preserve">github.com/[user]/pm-leadlag</w:t>
+        <w:t xml:space="preserve">github.com/aicgoraya/pm-leadlag</w:t>
       </w:r>
       <w:r>
         <w:t xml:space="preserve">. Polymarket price histories are pulled by</w:t>
@@ -2485,7 +2627,7 @@
         <w:t xml:space="preserve"> </w:t>
       </w:r>
       <w:r>
-        <w:t xml:space="preserve">with a free Massive key. The full battery runs in about eight minutes.</w:t>
+        <w:t xml:space="preserve">with a free Massive key. The full battery runs in about forty minutes on two cores.</w:t>
       </w:r>
     </w:p>
     <w:bookmarkEnd w:id="52"/>

</xml_diff>